<commit_message>
Release prep: cut 3.1.1
</commit_message>
<xml_diff>
--- a/WP-Operations-Runbook.docx
+++ b/WP-Operations-Runbook.docx
@@ -31,7 +31,7 @@
         <w:pStyle w:val="Date"/>
       </w:pPr>
       <w:r>
-        <w:t xml:space="preserve">June 15, 2026</w:t>
+        <w:t xml:space="preserve">June 17, 2026</w:t>
       </w:r>
     </w:p>
     <w:sdt>
@@ -533,7 +533,7 @@
         </w:pict>
       </w:r>
     </w:p>
-    <w:bookmarkStart w:id="25" w:name="section-1-document-information"/>
+    <w:bookmarkStart w:id="45" w:name="section-1-document-information"/>
     <w:p>
       <w:pPr>
         <w:pStyle w:val="Heading2"/>
@@ -542,7 +542,7 @@
         <w:t xml:space="preserve">Section 1: Document Information</w:t>
       </w:r>
     </w:p>
-    <w:bookmarkStart w:id="20" w:name="purpose"/>
+    <w:bookmarkStart w:id="40" w:name="purpose"/>
     <w:p>
       <w:pPr>
         <w:pStyle w:val="Heading3"/>
@@ -619,8 +619,8 @@
         <w:t xml:space="preserve">Deployment workflows and rollback procedures</w:t>
       </w:r>
     </w:p>
-    <w:bookmarkEnd w:id="20"/>
-    <w:bookmarkStart w:id="21" w:name="audience"/>
+    <w:bookmarkEnd w:id="40"/>
+    <w:bookmarkStart w:id="41" w:name="audience"/>
     <w:p>
       <w:pPr>
         <w:pStyle w:val="Heading3"/>
@@ -697,8 +697,8 @@
         <w:t xml:space="preserve">Security operations center (SOC) personnel</w:t>
       </w:r>
     </w:p>
-    <w:bookmarkEnd w:id="21"/>
-    <w:bookmarkStart w:id="22" w:name="conventions"/>
+    <w:bookmarkEnd w:id="41"/>
+    <w:bookmarkStart w:id="42" w:name="conventions"/>
     <w:p>
       <w:pPr>
         <w:pStyle w:val="Heading3"/>
@@ -1161,8 +1161,8 @@
         <w:t xml:space="preserve">Escalate If</w:t>
       </w:r>
     </w:p>
-    <w:bookmarkEnd w:id="22"/>
-    <w:bookmarkStart w:id="23" w:name="version-history"/>
+    <w:bookmarkEnd w:id="42"/>
+    <w:bookmarkStart w:id="43" w:name="version-history"/>
     <w:p>
       <w:pPr>
         <w:pStyle w:val="Heading3"/>
@@ -1372,8 +1372,8 @@
         </w:tc>
       </w:tr>
     </w:tbl>
-    <w:bookmarkEnd w:id="23"/>
-    <w:bookmarkStart w:id="24" w:name="freshness-guardrails"/>
+    <w:bookmarkEnd w:id="43"/>
+    <w:bookmarkStart w:id="44" w:name="freshness-guardrails"/>
     <w:p>
       <w:pPr>
         <w:pStyle w:val="Heading3"/>
@@ -1487,9 +1487,9 @@
         </w:pict>
       </w:r>
     </w:p>
-    <w:bookmarkEnd w:id="24"/>
-    <w:bookmarkEnd w:id="25"/>
-    <w:bookmarkStart w:id="29" w:name="section-2-site-overview"/>
+    <w:bookmarkEnd w:id="44"/>
+    <w:bookmarkEnd w:id="45"/>
+    <w:bookmarkStart w:id="49" w:name="section-2-site-overview"/>
     <w:p>
       <w:pPr>
         <w:pStyle w:val="Heading2"/>
@@ -1498,7 +1498,7 @@
         <w:t xml:space="preserve">Section 2: Site Overview</w:t>
       </w:r>
     </w:p>
-    <w:bookmarkStart w:id="26" w:name="site-identity"/>
+    <w:bookmarkStart w:id="46" w:name="site-identity"/>
     <w:p>
       <w:pPr>
         <w:pStyle w:val="Heading3"/>
@@ -1798,8 +1798,8 @@
         </w:tc>
       </w:tr>
     </w:tbl>
-    <w:bookmarkEnd w:id="26"/>
-    <w:bookmarkStart w:id="27" w:name="credentials-and-secrets"/>
+    <w:bookmarkEnd w:id="46"/>
+    <w:bookmarkStart w:id="47" w:name="credentials-and-secrets"/>
     <w:p>
       <w:pPr>
         <w:pStyle w:val="Heading3"/>
@@ -2139,8 +2139,8 @@
         </w:tc>
       </w:tr>
     </w:tbl>
-    <w:bookmarkEnd w:id="27"/>
-    <w:bookmarkStart w:id="28" w:name="user-roles-and-responsibilities"/>
+    <w:bookmarkEnd w:id="47"/>
+    <w:bookmarkStart w:id="48" w:name="user-roles-and-responsibilities"/>
     <w:p>
       <w:pPr>
         <w:pStyle w:val="Heading3"/>
@@ -2469,9 +2469,9 @@
         </w:pict>
       </w:r>
     </w:p>
-    <w:bookmarkEnd w:id="28"/>
-    <w:bookmarkEnd w:id="29"/>
-    <w:bookmarkStart w:id="35" w:name="section-3-environment-reference"/>
+    <w:bookmarkEnd w:id="48"/>
+    <w:bookmarkEnd w:id="49"/>
+    <w:bookmarkStart w:id="55" w:name="section-3-environment-reference"/>
     <w:p>
       <w:pPr>
         <w:pStyle w:val="Heading2"/>
@@ -2488,7 +2488,7 @@
         <w:t xml:space="preserve">Unless a procedure explicitly says otherwise, host-level commands in this runbook assume a self-managed Linux deployment with shell access, direct service control, local backup paths, and direct database administration. On managed hosting platforms, use the provider’s equivalent controls or provider-escalation path instead of forcing self-managed commands onto an environment that does not expose them.</w:t>
       </w:r>
     </w:p>
-    <w:bookmarkStart w:id="30" w:name="architecture-overview-lemp-stack"/>
+    <w:bookmarkStart w:id="50" w:name="architecture-overview-lemp-stack"/>
     <w:p>
       <w:pPr>
         <w:pStyle w:val="Heading3"/>
@@ -2735,8 +2735,8 @@
         <w:t xml:space="preserve">└─────────────────────────────────────────────────────────┘</w:t>
       </w:r>
     </w:p>
-    <w:bookmarkEnd w:id="30"/>
-    <w:bookmarkStart w:id="31" w:name="service-configuration-reference"/>
+    <w:bookmarkEnd w:id="50"/>
+    <w:bookmarkStart w:id="51" w:name="service-configuration-reference"/>
     <w:p>
       <w:pPr>
         <w:pStyle w:val="Heading3"/>
@@ -3156,8 +3156,8 @@
         </w:tc>
       </w:tr>
     </w:tbl>
-    <w:bookmarkEnd w:id="31"/>
-    <w:bookmarkStart w:id="32" w:name="caching-architecture"/>
+    <w:bookmarkEnd w:id="51"/>
+    <w:bookmarkStart w:id="52" w:name="caching-architecture"/>
     <w:p>
       <w:pPr>
         <w:pStyle w:val="Heading3"/>
@@ -3479,8 +3479,8 @@
         </w:tc>
       </w:tr>
     </w:tbl>
-    <w:bookmarkEnd w:id="32"/>
-    <w:bookmarkStart w:id="33" w:name="file-system-locations"/>
+    <w:bookmarkEnd w:id="52"/>
+    <w:bookmarkStart w:id="53" w:name="file-system-locations"/>
     <w:p>
       <w:pPr>
         <w:pStyle w:val="Heading3"/>
@@ -3725,8 +3725,8 @@
         <w:t xml:space="preserve">    └── key.pem</w:t>
       </w:r>
     </w:p>
-    <w:bookmarkEnd w:id="33"/>
-    <w:bookmarkStart w:id="34" w:name="ssltls-configuration"/>
+    <w:bookmarkEnd w:id="53"/>
+    <w:bookmarkStart w:id="54" w:name="ssltls-configuration"/>
     <w:p>
       <w:pPr>
         <w:pStyle w:val="Heading3"/>
@@ -4282,9 +4282,9 @@
         </w:pict>
       </w:r>
     </w:p>
-    <w:bookmarkEnd w:id="34"/>
-    <w:bookmarkEnd w:id="35"/>
-    <w:bookmarkStart w:id="41" w:name="section-4-development-workflow"/>
+    <w:bookmarkEnd w:id="54"/>
+    <w:bookmarkEnd w:id="55"/>
+    <w:bookmarkStart w:id="61" w:name="section-4-development-workflow"/>
     <w:p>
       <w:pPr>
         <w:pStyle w:val="Heading2"/>
@@ -4293,7 +4293,7 @@
         <w:t xml:space="preserve">Section 4: Development Workflow</w:t>
       </w:r>
     </w:p>
-    <w:bookmarkStart w:id="36" w:name="version-control-strategy"/>
+    <w:bookmarkStart w:id="56" w:name="version-control-strategy"/>
     <w:p>
       <w:pPr>
         <w:pStyle w:val="Heading3"/>
@@ -4511,8 +4511,8 @@
         <w:t xml:space="preserve">- New features for next release</w:t>
       </w:r>
     </w:p>
-    <w:bookmarkEnd w:id="36"/>
-    <w:bookmarkStart w:id="39" w:name="deployment-workflow"/>
+    <w:bookmarkEnd w:id="56"/>
+    <w:bookmarkStart w:id="59" w:name="deployment-workflow"/>
     <w:p>
       <w:pPr>
         <w:pStyle w:val="Heading3"/>
@@ -4727,11 +4727,11 @@
           <w:numId w:val="1000"/>
         </w:numPr>
       </w:pPr>
-      <w:bookmarkStart w:id="37" w:name="pull-latest-code"/>
+      <w:bookmarkStart w:id="57" w:name="pull-latest-code"/>
       <w:r>
         <w:t xml:space="preserve">Pull latest code</w:t>
       </w:r>
-      <w:bookmarkEnd w:id="37"/>
+      <w:bookmarkEnd w:id="57"/>
     </w:p>
     <w:p>
       <w:pPr>
@@ -4758,11 +4758,11 @@
           <w:numId w:val="1000"/>
         </w:numPr>
       </w:pPr>
-      <w:bookmarkStart w:id="38" w:name="installupdate-dependencies"/>
+      <w:bookmarkStart w:id="58" w:name="installupdate-dependencies"/>
       <w:r>
         <w:t xml:space="preserve">Install/update dependencies</w:t>
       </w:r>
-      <w:bookmarkEnd w:id="38"/>
+      <w:bookmarkEnd w:id="58"/>
     </w:p>
     <w:p>
       <w:pPr>
@@ -5511,8 +5511,8 @@
         <w:t xml:space="preserve">Be ready to rollback if needed</w:t>
       </w:r>
     </w:p>
-    <w:bookmarkEnd w:id="39"/>
-    <w:bookmarkStart w:id="40" w:name="staging-synchronization"/>
+    <w:bookmarkEnd w:id="59"/>
+    <w:bookmarkStart w:id="60" w:name="staging-synchronization"/>
     <w:p>
       <w:pPr>
         <w:pStyle w:val="Heading3"/>
@@ -6113,9 +6113,9 @@
         </w:pict>
       </w:r>
     </w:p>
-    <w:bookmarkEnd w:id="40"/>
-    <w:bookmarkEnd w:id="41"/>
-    <w:bookmarkStart w:id="51" w:name="section-5-security-hardening"/>
+    <w:bookmarkEnd w:id="60"/>
+    <w:bookmarkEnd w:id="61"/>
+    <w:bookmarkStart w:id="71" w:name="section-5-security-hardening"/>
     <w:p>
       <w:pPr>
         <w:pStyle w:val="Heading2"/>
@@ -6124,7 +6124,7 @@
         <w:t xml:space="preserve">Section 5: Security Hardening</w:t>
       </w:r>
     </w:p>
-    <w:bookmarkStart w:id="42" w:name="firewall-and-ssh-configuration"/>
+    <w:bookmarkStart w:id="62" w:name="firewall-and-ssh-configuration"/>
     <w:p>
       <w:pPr>
         <w:pStyle w:val="Heading3"/>
@@ -6635,8 +6635,8 @@
         <w:t xml:space="preserve">Test SSH access before closing your current session to avoid lockout.</w:t>
       </w:r>
     </w:p>
-    <w:bookmarkEnd w:id="42"/>
-    <w:bookmarkStart w:id="44" w:name="wordpress-hardening"/>
+    <w:bookmarkEnd w:id="62"/>
+    <w:bookmarkStart w:id="64" w:name="wordpress-hardening"/>
     <w:p>
       <w:pPr>
         <w:pStyle w:val="Heading3"/>
@@ -6935,7 +6935,7 @@
       <w:r>
         <w:t xml:space="preserve"> </w:t>
       </w:r>
-      <w:hyperlink r:id="rId43">
+      <w:hyperlink r:id="rId63">
         <w:r>
           <w:rPr>
             <w:rStyle w:val="Hyperlink"/>
@@ -6950,8 +6950,8 @@
         <w:t xml:space="preserve">for comprehensive REST API security guidance.</w:t>
       </w:r>
     </w:p>
-    <w:bookmarkEnd w:id="44"/>
-    <w:bookmarkStart w:id="46" w:name="http-security-headers"/>
+    <w:bookmarkEnd w:id="64"/>
+    <w:bookmarkStart w:id="66" w:name="http-security-headers"/>
     <w:p>
       <w:pPr>
         <w:pStyle w:val="Heading3"/>
@@ -7313,7 +7313,7 @@
       <w:r>
         <w:t xml:space="preserve"> </w:t>
       </w:r>
-      <w:hyperlink r:id="rId45">
+      <w:hyperlink r:id="rId65">
         <w:r>
           <w:rPr>
             <w:rStyle w:val="Hyperlink"/>
@@ -7343,8 +7343,8 @@
         <w:t xml:space="preserve">from CSP.</w:t>
       </w:r>
     </w:p>
-    <w:bookmarkEnd w:id="46"/>
-    <w:bookmarkStart w:id="47" w:name="rest-api-and-xml-rpc-management"/>
+    <w:bookmarkEnd w:id="66"/>
+    <w:bookmarkStart w:id="67" w:name="rest-api-and-xml-rpc-management"/>
     <w:p>
       <w:pPr>
         <w:pStyle w:val="Heading3"/>
@@ -7373,7 +7373,7 @@
       <w:r>
         <w:t xml:space="preserve"> </w:t>
       </w:r>
-      <w:hyperlink r:id="rId43">
+      <w:hyperlink r:id="rId63">
         <w:r>
           <w:rPr>
             <w:rStyle w:val="Hyperlink"/>
@@ -7387,7 +7387,7 @@
       <w:r>
         <w:t xml:space="preserve"> </w:t>
       </w:r>
-      <w:hyperlink r:id="rId45">
+      <w:hyperlink r:id="rId65">
         <w:r>
           <w:rPr>
             <w:rStyle w:val="Hyperlink"/>
@@ -8600,8 +8600,8 @@
         <w:t xml:space="preserve">-20</w:t>
       </w:r>
     </w:p>
-    <w:bookmarkEnd w:id="47"/>
-    <w:bookmarkStart w:id="49" w:name="X6c682bf2d2d53acf340f5a675ccfd1467198b09"/>
+    <w:bookmarkEnd w:id="67"/>
+    <w:bookmarkStart w:id="69" w:name="X6c682bf2d2d53acf340f5a675ccfd1467198b09"/>
     <w:p>
       <w:pPr>
         <w:pStyle w:val="Heading3"/>
@@ -8638,7 +8638,7 @@
       <w:r>
         <w:t xml:space="preserve"> </w:t>
       </w:r>
-      <w:hyperlink r:id="rId45">
+      <w:hyperlink r:id="rId65">
         <w:r>
           <w:rPr>
             <w:rStyle w:val="Hyperlink"/>
@@ -9187,7 +9187,7 @@
         <w:t xml:space="preserve">Any bypass window must be ticketed, time-bounded, approved by the incident owner, and reviewed after closure. When a global disable is unavoidable, apply compensating controls immediately and re-enroll affected users before closing the incident.</w:t>
       </w:r>
     </w:p>
-    <w:bookmarkStart w:id="48" w:name="X37237a1dc58b45a6cfca1d7e895c6cd8d4ad0dc"/>
+    <w:bookmarkStart w:id="68" w:name="X37237a1dc58b45a6cfca1d7e895c6cd8d4ad0dc"/>
     <w:p>
       <w:pPr>
         <w:pStyle w:val="Heading4"/>
@@ -9237,7 +9237,7 @@
       <w:r>
         <w:t xml:space="preserve"> </w:t>
       </w:r>
-      <w:hyperlink r:id="rId45">
+      <w:hyperlink r:id="rId65">
         <w:r>
           <w:rPr>
             <w:rStyle w:val="Hyperlink"/>
@@ -9254,7 +9254,7 @@
       <w:r>
         <w:t xml:space="preserve"> </w:t>
       </w:r>
-      <w:hyperlink r:id="rId43">
+      <w:hyperlink r:id="rId63">
         <w:r>
           <w:rPr>
             <w:rStyle w:val="Hyperlink"/>
@@ -9651,9 +9651,9 @@
         <w:t xml:space="preserve">accounts.</w:t>
       </w:r>
     </w:p>
-    <w:bookmarkEnd w:id="48"/>
-    <w:bookmarkEnd w:id="49"/>
-    <w:bookmarkStart w:id="50" w:name="file-integrity-monitoring-fim"/>
+    <w:bookmarkEnd w:id="68"/>
+    <w:bookmarkEnd w:id="69"/>
+    <w:bookmarkStart w:id="70" w:name="file-integrity-monitoring-fim"/>
     <w:p>
       <w:pPr>
         <w:pStyle w:val="Heading3"/>
@@ -10250,9 +10250,9 @@
         </w:pict>
       </w:r>
     </w:p>
-    <w:bookmarkEnd w:id="50"/>
-    <w:bookmarkEnd w:id="51"/>
-    <w:bookmarkStart w:id="61" w:name="section-6-routine-maintenance"/>
+    <w:bookmarkEnd w:id="70"/>
+    <w:bookmarkEnd w:id="71"/>
+    <w:bookmarkStart w:id="81" w:name="section-6-routine-maintenance"/>
     <w:p>
       <w:pPr>
         <w:pStyle w:val="Heading2"/>
@@ -10269,7 +10269,7 @@
         <w:t xml:space="preserve">Lifecycle metadata for critical maintenance procedures is tracked in Appendix E.</w:t>
       </w:r>
     </w:p>
-    <w:bookmarkStart w:id="52" w:name="maintenance-calendar"/>
+    <w:bookmarkStart w:id="72" w:name="maintenance-calendar"/>
     <w:p>
       <w:pPr>
         <w:pStyle w:val="Heading3"/>
@@ -11102,8 +11102,8 @@
         <w:t xml:space="preserve">Update as available; prioritize security updates immediately</w:t>
       </w:r>
     </w:p>
-    <w:bookmarkEnd w:id="52"/>
-    <w:bookmarkStart w:id="53" w:name="wordpress-core-updates"/>
+    <w:bookmarkEnd w:id="72"/>
+    <w:bookmarkStart w:id="73" w:name="wordpress-core-updates"/>
     <w:p>
       <w:pPr>
         <w:pStyle w:val="Heading3"/>
@@ -11158,7 +11158,7 @@
       <w:r>
         <w:t xml:space="preserve"> </w:t>
       </w:r>
-      <w:hyperlink r:id="rId45">
+      <w:hyperlink r:id="rId65">
         <w:r>
           <w:rPr>
             <w:rStyle w:val="Hyperlink"/>
@@ -11963,8 +11963,8 @@
         <w:t xml:space="preserve">Minor updates are generally lower risk. Major updates should be tested on staging first and aligned with the current supported major release.</w:t>
       </w:r>
     </w:p>
-    <w:bookmarkEnd w:id="53"/>
-    <w:bookmarkStart w:id="54" w:name="plugin-and-theme-updates"/>
+    <w:bookmarkEnd w:id="73"/>
+    <w:bookmarkStart w:id="74" w:name="plugin-and-theme-updates"/>
     <w:p>
       <w:pPr>
         <w:pStyle w:val="Heading3"/>
@@ -12019,7 +12019,7 @@
       <w:r>
         <w:t xml:space="preserve"> </w:t>
       </w:r>
-      <w:hyperlink r:id="rId45">
+      <w:hyperlink r:id="rId65">
         <w:r>
           <w:rPr>
             <w:rStyle w:val="Hyperlink"/>
@@ -13138,8 +13138,8 @@
         <w:t xml:space="preserve">Keep a log of updates in your change management system. Document any issues encountered.</w:t>
       </w:r>
     </w:p>
-    <w:bookmarkEnd w:id="54"/>
-    <w:bookmarkStart w:id="55" w:name="database-optimization"/>
+    <w:bookmarkEnd w:id="74"/>
+    <w:bookmarkStart w:id="75" w:name="database-optimization"/>
     <w:p>
       <w:pPr>
         <w:pStyle w:val="Heading3"/>
@@ -13847,8 +13847,8 @@
         <w:t xml:space="preserve">--expired</w:t>
       </w:r>
     </w:p>
-    <w:bookmarkEnd w:id="55"/>
-    <w:bookmarkStart w:id="56" w:name="php-version-upgrade"/>
+    <w:bookmarkEnd w:id="75"/>
+    <w:bookmarkStart w:id="76" w:name="php-version-upgrade"/>
     <w:p>
       <w:pPr>
         <w:pStyle w:val="Heading3"/>
@@ -14715,8 +14715,8 @@
         <w:t xml:space="preserve">Check database connections</w:t>
       </w:r>
     </w:p>
-    <w:bookmarkEnd w:id="56"/>
-    <w:bookmarkStart w:id="57" w:name="wordpress-cron-wp-cron-management"/>
+    <w:bookmarkEnd w:id="76"/>
+    <w:bookmarkStart w:id="77" w:name="wordpress-cron-wp-cron-management"/>
     <w:p>
       <w:pPr>
         <w:pStyle w:val="Heading3"/>
@@ -15730,7 +15730,7 @@
       <w:r>
         <w:t xml:space="preserve"> </w:t>
       </w:r>
-      <w:hyperlink r:id="rId45">
+      <w:hyperlink r:id="rId65">
         <w:r>
           <w:rPr>
             <w:rStyle w:val="Hyperlink"/>
@@ -15745,8 +15745,8 @@
         <w:t xml:space="preserve">for the full rationale.</w:t>
       </w:r>
     </w:p>
-    <w:bookmarkEnd w:id="57"/>
-    <w:bookmarkStart w:id="58" w:name="transactional-email-management"/>
+    <w:bookmarkEnd w:id="77"/>
+    <w:bookmarkStart w:id="78" w:name="transactional-email-management"/>
     <w:p>
       <w:pPr>
         <w:pStyle w:val="Heading3"/>
@@ -16476,8 +16476,8 @@
         <w:t xml:space="preserve"> /var/log/php-errors.log</w:t>
       </w:r>
     </w:p>
-    <w:bookmarkEnd w:id="58"/>
-    <w:bookmarkStart w:id="59" w:name="log-rotation"/>
+    <w:bookmarkEnd w:id="78"/>
+    <w:bookmarkStart w:id="79" w:name="log-rotation"/>
     <w:p>
       <w:pPr>
         <w:pStyle w:val="Heading3"/>
@@ -17690,8 +17690,8 @@
         <w:t xml:space="preserve">*</w:t>
       </w:r>
     </w:p>
-    <w:bookmarkEnd w:id="59"/>
-    <w:bookmarkStart w:id="60" w:name="monitoring-and-alerting"/>
+    <w:bookmarkEnd w:id="79"/>
+    <w:bookmarkStart w:id="80" w:name="monitoring-and-alerting"/>
     <w:p>
       <w:pPr>
         <w:pStyle w:val="Heading3"/>
@@ -19268,9 +19268,9 @@
         </w:pict>
       </w:r>
     </w:p>
-    <w:bookmarkEnd w:id="60"/>
-    <w:bookmarkEnd w:id="61"/>
-    <w:bookmarkStart w:id="65" w:name="section-7-backup-procedures"/>
+    <w:bookmarkEnd w:id="80"/>
+    <w:bookmarkEnd w:id="81"/>
+    <w:bookmarkStart w:id="85" w:name="section-7-backup-procedures"/>
     <w:p>
       <w:pPr>
         <w:pStyle w:val="Heading2"/>
@@ -19279,7 +19279,7 @@
         <w:t xml:space="preserve">Section 7: Backup Procedures</w:t>
       </w:r>
     </w:p>
-    <w:bookmarkStart w:id="62" w:name="backup-strategy"/>
+    <w:bookmarkStart w:id="82" w:name="backup-strategy"/>
     <w:p>
       <w:pPr>
         <w:pStyle w:val="Heading3"/>
@@ -19713,8 +19713,8 @@
         <w:t xml:space="preserve">Offsite backup storage must be encrypted and isolated from normal production-host access. Use write-only or tightly scoped credentials where possible so the production host can upload new backups without being able to browse or delete retained recovery points.</w:t>
       </w:r>
     </w:p>
-    <w:bookmarkEnd w:id="62"/>
-    <w:bookmarkStart w:id="63" w:name="automated-backup-script"/>
+    <w:bookmarkEnd w:id="82"/>
+    <w:bookmarkStart w:id="83" w:name="automated-backup-script"/>
     <w:p>
       <w:pPr>
         <w:pStyle w:val="Heading3"/>
@@ -22502,8 +22502,8 @@
         <w:t xml:space="preserve"> 0 /usr/local/bin/wordpress-backup.sh</w:t>
       </w:r>
     </w:p>
-    <w:bookmarkEnd w:id="63"/>
-    <w:bookmarkStart w:id="64" w:name="backup-verification"/>
+    <w:bookmarkEnd w:id="83"/>
+    <w:bookmarkStart w:id="84" w:name="backup-verification"/>
     <w:p>
       <w:pPr>
         <w:pStyle w:val="Heading3"/>
@@ -23299,9 +23299,9 @@
         </w:pict>
       </w:r>
     </w:p>
-    <w:bookmarkEnd w:id="64"/>
-    <w:bookmarkEnd w:id="65"/>
-    <w:bookmarkStart w:id="69" w:name="section-8-deployment-procedures"/>
+    <w:bookmarkEnd w:id="84"/>
+    <w:bookmarkEnd w:id="85"/>
+    <w:bookmarkStart w:id="89" w:name="section-8-deployment-procedures"/>
     <w:p>
       <w:pPr>
         <w:pStyle w:val="Heading2"/>
@@ -23318,7 +23318,7 @@
         <w:t xml:space="preserve">Lifecycle metadata for deployment procedures is tracked in Appendix E.</w:t>
       </w:r>
     </w:p>
-    <w:bookmarkStart w:id="66" w:name="code-deployment"/>
+    <w:bookmarkStart w:id="86" w:name="code-deployment"/>
     <w:p>
       <w:pPr>
         <w:pStyle w:val="Heading3"/>
@@ -23950,8 +23950,8 @@
         <w:t xml:space="preserve">Service remains degraded after rollback.</w:t>
       </w:r>
     </w:p>
-    <w:bookmarkEnd w:id="66"/>
-    <w:bookmarkStart w:id="67" w:name="database-migration"/>
+    <w:bookmarkEnd w:id="86"/>
+    <w:bookmarkStart w:id="87" w:name="database-migration"/>
     <w:p>
       <w:pPr>
         <w:pStyle w:val="Heading3"/>
@@ -25250,8 +25250,8 @@
         <w:t xml:space="preserve">Post-migration errors persist after cache flush and URL correction.</w:t>
       </w:r>
     </w:p>
-    <w:bookmarkEnd w:id="67"/>
-    <w:bookmarkStart w:id="68" w:name="rollback-procedure"/>
+    <w:bookmarkEnd w:id="87"/>
+    <w:bookmarkStart w:id="88" w:name="rollback-procedure"/>
     <w:p>
       <w:pPr>
         <w:pStyle w:val="Heading3"/>
@@ -26369,9 +26369,9 @@
         </w:pict>
       </w:r>
     </w:p>
-    <w:bookmarkEnd w:id="68"/>
-    <w:bookmarkEnd w:id="69"/>
-    <w:bookmarkStart w:id="74" w:name="section-9-content-operations"/>
+    <w:bookmarkEnd w:id="88"/>
+    <w:bookmarkEnd w:id="89"/>
+    <w:bookmarkStart w:id="94" w:name="section-9-content-operations"/>
     <w:p>
       <w:pPr>
         <w:pStyle w:val="Heading2"/>
@@ -26380,7 +26380,7 @@
         <w:t xml:space="preserve">Section 9: Content Operations</w:t>
       </w:r>
     </w:p>
-    <w:bookmarkStart w:id="70" w:name="media-management"/>
+    <w:bookmarkStart w:id="90" w:name="media-management"/>
     <w:p>
       <w:pPr>
         <w:pStyle w:val="Heading3"/>
@@ -26937,8 +26937,8 @@
         <w:t xml:space="preserve">}'</w:t>
       </w:r>
     </w:p>
-    <w:bookmarkEnd w:id="70"/>
-    <w:bookmarkStart w:id="71" w:name="publishing-workflow"/>
+    <w:bookmarkEnd w:id="90"/>
+    <w:bookmarkStart w:id="91" w:name="publishing-workflow"/>
     <w:p>
       <w:pPr>
         <w:pStyle w:val="Heading3"/>
@@ -27796,8 +27796,8 @@
         <w:t xml:space="preserve">table</w:t>
       </w:r>
     </w:p>
-    <w:bookmarkEnd w:id="71"/>
-    <w:bookmarkStart w:id="72" w:name="taxonomy-and-permalink-management"/>
+    <w:bookmarkEnd w:id="91"/>
+    <w:bookmarkStart w:id="92" w:name="taxonomy-and-permalink-management"/>
     <w:p>
       <w:pPr>
         <w:pStyle w:val="Heading3"/>
@@ -28630,8 +28630,8 @@
         <w:t xml:space="preserve">});</w:t>
       </w:r>
     </w:p>
-    <w:bookmarkEnd w:id="72"/>
-    <w:bookmarkStart w:id="73" w:name="search-and-indexing"/>
+    <w:bookmarkEnd w:id="92"/>
+    <w:bookmarkStart w:id="93" w:name="search-and-indexing"/>
     <w:p>
       <w:pPr>
         <w:pStyle w:val="Heading3"/>
@@ -29214,9 +29214,9 @@
         </w:pict>
       </w:r>
     </w:p>
-    <w:bookmarkEnd w:id="73"/>
-    <w:bookmarkEnd w:id="74"/>
-    <w:bookmarkStart w:id="82" w:name="section-10-incident-response"/>
+    <w:bookmarkEnd w:id="93"/>
+    <w:bookmarkEnd w:id="94"/>
+    <w:bookmarkStart w:id="102" w:name="section-10-incident-response"/>
     <w:p>
       <w:pPr>
         <w:pStyle w:val="Heading2"/>
@@ -29345,7 +29345,7 @@
         <w:t xml:space="preserve">)</w:t>
       </w:r>
     </w:p>
-    <w:bookmarkStart w:id="75" w:name="severity-classification"/>
+    <w:bookmarkStart w:id="95" w:name="severity-classification"/>
     <w:p>
       <w:pPr>
         <w:pStyle w:val="Heading3"/>
@@ -29716,8 +29716,8 @@
         </w:tc>
       </w:tr>
     </w:tbl>
-    <w:bookmarkEnd w:id="75"/>
-    <w:bookmarkStart w:id="76" w:name="site-down-500-error-triage"/>
+    <w:bookmarkEnd w:id="95"/>
+    <w:bookmarkStart w:id="96" w:name="site-down-500-error-triage"/>
     <w:p>
       <w:pPr>
         <w:pStyle w:val="Heading3"/>
@@ -31284,8 +31284,8 @@
         <w:t xml:space="preserve">Confirm Dashboard login and at least one critical business workflow (e.g., [CUSTOMIZE: test checkout, form submission, or user registration]) before closing incident.</w:t>
       </w:r>
     </w:p>
-    <w:bookmarkEnd w:id="76"/>
-    <w:bookmarkStart w:id="78" w:name="security-breach-response"/>
+    <w:bookmarkEnd w:id="96"/>
+    <w:bookmarkStart w:id="98" w:name="security-breach-response"/>
     <w:p>
       <w:pPr>
         <w:pStyle w:val="Heading3"/>
@@ -31358,7 +31358,7 @@
       <w:r>
         <w:t xml:space="preserve"> </w:t>
       </w:r>
-      <w:hyperlink r:id="rId43">
+      <w:hyperlink r:id="rId63">
         <w:r>
           <w:rPr>
             <w:rStyle w:val="Hyperlink"/>
@@ -33658,7 +33658,7 @@
       <w:r>
         <w:t xml:space="preserve"> </w:t>
       </w:r>
-      <w:hyperlink r:id="rId77">
+      <w:hyperlink r:id="rId97">
         <w:r>
           <w:rPr>
             <w:rStyle w:val="Hyperlink"/>
@@ -33673,8 +33673,8 @@
         <w:t xml:space="preserve">§7 for vulnerability severity language and disclosure practices.</w:t>
       </w:r>
     </w:p>
-    <w:bookmarkEnd w:id="78"/>
-    <w:bookmarkStart w:id="79" w:name="incident-roles-and-escalation-path"/>
+    <w:bookmarkEnd w:id="98"/>
+    <w:bookmarkStart w:id="99" w:name="incident-roles-and-escalation-path"/>
     <w:p>
       <w:pPr>
         <w:pStyle w:val="Heading3"/>
@@ -34240,8 +34240,8 @@
         <w:t xml:space="preserve">The ordering above reflects escalation depth, not engagement sequence. The Incident Commander role is typically assumed by the On-Call SysAdmin at incident start and formally handed off when a senior IC is engaged.</w:t>
       </w:r>
     </w:p>
-    <w:bookmarkEnd w:id="79"/>
-    <w:bookmarkStart w:id="80" w:name="performance-degradation"/>
+    <w:bookmarkEnd w:id="99"/>
+    <w:bookmarkStart w:id="100" w:name="performance-degradation"/>
     <w:p>
       <w:pPr>
         <w:pStyle w:val="Heading3"/>
@@ -35070,7 +35070,7 @@
       <w:r>
         <w:t xml:space="preserve"> </w:t>
       </w:r>
-      <w:hyperlink r:id="rId43">
+      <w:hyperlink r:id="rId63">
         <w:r>
           <w:rPr>
             <w:rStyle w:val="Hyperlink"/>
@@ -35507,8 +35507,8 @@
         <w:t xml:space="preserve">Confirm response time and host utilization return to baseline for at least 15 minutes.</w:t>
       </w:r>
     </w:p>
-    <w:bookmarkEnd w:id="80"/>
-    <w:bookmarkStart w:id="81" w:name="post-incident-review"/>
+    <w:bookmarkEnd w:id="100"/>
+    <w:bookmarkStart w:id="101" w:name="post-incident-review"/>
     <w:p>
       <w:pPr>
         <w:pStyle w:val="Heading3"/>
@@ -36375,9 +36375,9 @@
         </w:pict>
       </w:r>
     </w:p>
-    <w:bookmarkEnd w:id="81"/>
-    <w:bookmarkEnd w:id="82"/>
-    <w:bookmarkStart w:id="87" w:name="section-11-disaster-recovery"/>
+    <w:bookmarkEnd w:id="101"/>
+    <w:bookmarkEnd w:id="102"/>
+    <w:bookmarkStart w:id="107" w:name="section-11-disaster-recovery"/>
     <w:p>
       <w:pPr>
         <w:pStyle w:val="Heading2"/>
@@ -36394,7 +36394,7 @@
         <w:t xml:space="preserve">Lifecycle metadata for disaster recovery procedures is tracked in Appendix E.</w:t>
       </w:r>
     </w:p>
-    <w:bookmarkStart w:id="83" w:name="recovery-objectives"/>
+    <w:bookmarkStart w:id="103" w:name="recovery-objectives"/>
     <w:p>
       <w:pPr>
         <w:pStyle w:val="Heading3"/>
@@ -36724,8 +36724,8 @@
         <w:t xml:space="preserve">These targets assume proper backups and infrastructure in place. Regular testing is critical.</w:t>
       </w:r>
     </w:p>
-    <w:bookmarkEnd w:id="83"/>
-    <w:bookmarkStart w:id="84" w:name="full-site-restore-from-backup"/>
+    <w:bookmarkEnd w:id="103"/>
+    <w:bookmarkStart w:id="104" w:name="full-site-restore-from-backup"/>
     <w:p>
       <w:pPr>
         <w:pStyle w:val="Heading3"/>
@@ -38544,8 +38544,8 @@
         <w:t xml:space="preserve">Monitor error logs for 30 minutes</w:t>
       </w:r>
     </w:p>
-    <w:bookmarkEnd w:id="84"/>
-    <w:bookmarkStart w:id="85" w:name="database-only-recovery"/>
+    <w:bookmarkEnd w:id="104"/>
+    <w:bookmarkStart w:id="105" w:name="database-only-recovery"/>
     <w:p>
       <w:pPr>
         <w:pStyle w:val="Heading3"/>
@@ -39506,8 +39506,8 @@
         <w:t xml:space="preserve">Verify recent posts are present (or missing if intended)</w:t>
       </w:r>
     </w:p>
-    <w:bookmarkEnd w:id="85"/>
-    <w:bookmarkStart w:id="86" w:name="server-migration"/>
+    <w:bookmarkEnd w:id="105"/>
+    <w:bookmarkStart w:id="106" w:name="server-migration"/>
     <w:p>
       <w:pPr>
         <w:pStyle w:val="Heading3"/>
@@ -40516,9 +40516,9 @@
         </w:pict>
       </w:r>
     </w:p>
-    <w:bookmarkEnd w:id="86"/>
-    <w:bookmarkEnd w:id="87"/>
-    <w:bookmarkStart w:id="90" w:name="appendix-a-file-permissions-reference"/>
+    <w:bookmarkEnd w:id="106"/>
+    <w:bookmarkEnd w:id="107"/>
+    <w:bookmarkStart w:id="110" w:name="appendix-a-file-permissions-reference"/>
     <w:p>
       <w:pPr>
         <w:pStyle w:val="Heading2"/>
@@ -40527,7 +40527,7 @@
         <w:t xml:space="preserve">Appendix A: File Permissions Reference</w:t>
       </w:r>
     </w:p>
-    <w:bookmarkStart w:id="88" w:name="a.1-wordpress-file-permissions-table"/>
+    <w:bookmarkStart w:id="108" w:name="a.1-wordpress-file-permissions-table"/>
     <w:p>
       <w:pPr>
         <w:pStyle w:val="Heading3"/>
@@ -41341,8 +41341,8 @@
         </w:tc>
       </w:tr>
     </w:tbl>
-    <w:bookmarkEnd w:id="88"/>
-    <w:bookmarkStart w:id="89" w:name="a.2-permission-reset-script"/>
+    <w:bookmarkEnd w:id="108"/>
+    <w:bookmarkStart w:id="109" w:name="a.2-permission-reset-script"/>
     <w:p>
       <w:pPr>
         <w:pStyle w:val="Heading3"/>
@@ -42602,9 +42602,9 @@
         </w:pict>
       </w:r>
     </w:p>
-    <w:bookmarkEnd w:id="89"/>
-    <w:bookmarkEnd w:id="90"/>
-    <w:bookmarkStart w:id="100" w:name="appendix-b-wp-config.php-key-settings"/>
+    <w:bookmarkEnd w:id="109"/>
+    <w:bookmarkEnd w:id="110"/>
+    <w:bookmarkStart w:id="120" w:name="appendix-b-wp-config.php-key-settings"/>
     <w:p>
       <w:pPr>
         <w:pStyle w:val="Heading2"/>
@@ -42613,7 +42613,7 @@
         <w:t xml:space="preserve">Appendix B: wp-config.php Key Settings</w:t>
       </w:r>
     </w:p>
-    <w:bookmarkStart w:id="91" w:name="b.1-database-configuration"/>
+    <w:bookmarkStart w:id="111" w:name="b.1-database-configuration"/>
     <w:p>
       <w:pPr>
         <w:pStyle w:val="Heading3"/>
@@ -43065,8 +43065,8 @@
         <w:t xml:space="preserve">;</w:t>
       </w:r>
     </w:p>
-    <w:bookmarkEnd w:id="91"/>
-    <w:bookmarkStart w:id="92" w:name="b.2-security-keys-and-salts"/>
+    <w:bookmarkEnd w:id="111"/>
+    <w:bookmarkStart w:id="112" w:name="b.2-security-keys-and-salts"/>
     <w:p>
       <w:pPr>
         <w:pStyle w:val="Heading3"/>
@@ -43542,8 +43542,8 @@
         <w:t xml:space="preserve">Changing these keys will log out all users. Do this during maintenance window.</w:t>
       </w:r>
     </w:p>
-    <w:bookmarkEnd w:id="92"/>
-    <w:bookmarkStart w:id="93" w:name="b.3-security-constants"/>
+    <w:bookmarkEnd w:id="112"/>
+    <w:bookmarkStart w:id="113" w:name="b.3-security-constants"/>
     <w:p>
       <w:pPr>
         <w:pStyle w:val="Heading3"/>
@@ -43782,8 +43782,8 @@
         <w:t xml:space="preserve">// See Section 5.4 for endpoint-specific examples.</w:t>
       </w:r>
     </w:p>
-    <w:bookmarkEnd w:id="93"/>
-    <w:bookmarkStart w:id="94" w:name="b.4-debugging-constants"/>
+    <w:bookmarkEnd w:id="113"/>
+    <w:bookmarkStart w:id="114" w:name="b.4-debugging-constants"/>
     <w:p>
       <w:pPr>
         <w:pStyle w:val="Heading3"/>
@@ -44142,8 +44142,8 @@
         <w:t xml:space="preserve">// Track database queries (dev only)</w:t>
       </w:r>
     </w:p>
-    <w:bookmarkEnd w:id="94"/>
-    <w:bookmarkStart w:id="95" w:name="b.5-performance-constants"/>
+    <w:bookmarkEnd w:id="114"/>
+    <w:bookmarkStart w:id="115" w:name="b.5-performance-constants"/>
     <w:p>
       <w:pPr>
         <w:pStyle w:val="Heading3"/>
@@ -44812,8 +44812,8 @@
         <w:t xml:space="preserve">;</w:t>
       </w:r>
     </w:p>
-    <w:bookmarkEnd w:id="95"/>
-    <w:bookmarkStart w:id="96" w:name="b.6-wordpress-cron-constants"/>
+    <w:bookmarkEnd w:id="115"/>
+    <w:bookmarkStart w:id="116" w:name="b.6-wordpress-cron-constants"/>
     <w:p>
       <w:pPr>
         <w:pStyle w:val="Heading3"/>
@@ -44914,8 +44914,8 @@
         <w:t xml:space="preserve">// Block wp-cron.php at the web server level — see Section 6.6</w:t>
       </w:r>
     </w:p>
-    <w:bookmarkEnd w:id="96"/>
-    <w:bookmarkStart w:id="97" w:name="X149010d6657c5848e662d5823a8c4c8972a46d4"/>
+    <w:bookmarkEnd w:id="116"/>
+    <w:bookmarkStart w:id="117" w:name="X149010d6657c5848e662d5823a8c4c8972a46d4"/>
     <w:p>
       <w:pPr>
         <w:pStyle w:val="Heading3"/>
@@ -45316,8 +45316,8 @@
         <w:t xml:space="preserve">;</w:t>
       </w:r>
     </w:p>
-    <w:bookmarkEnd w:id="97"/>
-    <w:bookmarkStart w:id="98" w:name="b.8-path-configuration-optional"/>
+    <w:bookmarkEnd w:id="117"/>
+    <w:bookmarkStart w:id="118" w:name="b.8-path-configuration-optional"/>
     <w:p>
       <w:pPr>
         <w:pStyle w:val="Heading3"/>
@@ -45625,8 +45625,8 @@
         <w:t xml:space="preserve">;</w:t>
       </w:r>
     </w:p>
-    <w:bookmarkEnd w:id="98"/>
-    <w:bookmarkStart w:id="99" w:name="X186eb5130edef6aa71dcd6dda8c018f434ea4de"/>
+    <w:bookmarkEnd w:id="118"/>
+    <w:bookmarkStart w:id="119" w:name="X186eb5130edef6aa71dcd6dda8c018f434ea4de"/>
     <w:p>
       <w:pPr>
         <w:pStyle w:val="Heading3"/>
@@ -47852,9 +47852,9 @@
         </w:pict>
       </w:r>
     </w:p>
-    <w:bookmarkEnd w:id="99"/>
-    <w:bookmarkEnd w:id="100"/>
-    <w:bookmarkStart w:id="105" w:name="appendix-c-change-log"/>
+    <w:bookmarkEnd w:id="119"/>
+    <w:bookmarkEnd w:id="120"/>
+    <w:bookmarkStart w:id="125" w:name="appendix-c-change-log"/>
     <w:p>
       <w:pPr>
         <w:pStyle w:val="Heading2"/>
@@ -47863,7 +47863,7 @@
         <w:t xml:space="preserve">Appendix C: Change Log</w:t>
       </w:r>
     </w:p>
-    <w:bookmarkStart w:id="104" w:name="release-history"/>
+    <w:bookmarkStart w:id="124" w:name="release-history"/>
     <w:p>
       <w:pPr>
         <w:pStyle w:val="Heading3"/>
@@ -47880,7 +47880,7 @@
         <w:t xml:space="preserve">This section documents all updates to this runbook and corresponding infrastructure changes.</w:t>
       </w:r>
     </w:p>
-    <w:bookmarkStart w:id="101" w:name="version-2.0---february-2026"/>
+    <w:bookmarkStart w:id="121" w:name="version-2.0---february-2026"/>
     <w:p>
       <w:pPr>
         <w:pStyle w:val="Heading4"/>
@@ -48063,8 +48063,8 @@
         <w:t xml:space="preserve">- [CUSTOMIZE: Date] - Performance testing done</w:t>
       </w:r>
     </w:p>
-    <w:bookmarkEnd w:id="101"/>
-    <w:bookmarkStart w:id="102" w:name="version-1.5---august-2025"/>
+    <w:bookmarkEnd w:id="121"/>
+    <w:bookmarkStart w:id="122" w:name="version-1.5---august-2025"/>
     <w:p>
       <w:pPr>
         <w:pStyle w:val="Heading4"/>
@@ -48139,8 +48139,8 @@
         <w:t xml:space="preserve">- Upgraded PHP to 8.0</w:t>
       </w:r>
     </w:p>
-    <w:bookmarkEnd w:id="102"/>
-    <w:bookmarkStart w:id="103" w:name="version-1.0---february-2025"/>
+    <w:bookmarkEnd w:id="122"/>
+    <w:bookmarkStart w:id="123" w:name="version-1.0---february-2025"/>
     <w:p>
       <w:pPr>
         <w:pStyle w:val="Heading4"/>
@@ -48192,10 +48192,10 @@
         </w:pict>
       </w:r>
     </w:p>
-    <w:bookmarkEnd w:id="103"/>
-    <w:bookmarkEnd w:id="104"/>
-    <w:bookmarkEnd w:id="105"/>
-    <w:bookmarkStart w:id="106" w:name="X6ecd772a72c0183328049e537f0198da62ed77a"/>
+    <w:bookmarkEnd w:id="123"/>
+    <w:bookmarkEnd w:id="124"/>
+    <w:bookmarkEnd w:id="125"/>
+    <w:bookmarkStart w:id="126" w:name="X6ecd772a72c0183328049e537f0198da62ed77a"/>
     <w:p>
       <w:pPr>
         <w:pStyle w:val="Heading2"/>
@@ -48422,8 +48422,8 @@
         </w:pict>
       </w:r>
     </w:p>
-    <w:bookmarkEnd w:id="106"/>
-    <w:bookmarkStart w:id="107" w:name="X1262598f067e220788dc74e3c26903d0e8f0f8c"/>
+    <w:bookmarkEnd w:id="126"/>
+    <w:bookmarkStart w:id="127" w:name="X1262598f067e220788dc74e3c26903d0e8f0f8c"/>
     <w:p>
       <w:pPr>
         <w:pStyle w:val="Heading2"/>
@@ -49132,8 +49132,8 @@
         </w:pict>
       </w:r>
     </w:p>
-    <w:bookmarkEnd w:id="107"/>
-    <w:bookmarkStart w:id="108" w:name="quick-reference-card-printable"/>
+    <w:bookmarkEnd w:id="127"/>
+    <w:bookmarkStart w:id="128" w:name="quick-reference-card-printable"/>
     <w:p>
       <w:pPr>
         <w:pStyle w:val="Heading2"/>
@@ -49435,8 +49435,8 @@
         </w:pict>
       </w:r>
     </w:p>
-    <w:bookmarkEnd w:id="108"/>
-    <w:bookmarkStart w:id="117" w:name="related-documents"/>
+    <w:bookmarkEnd w:id="128"/>
+    <w:bookmarkStart w:id="137" w:name="related-documents"/>
     <w:p>
       <w:pPr>
         <w:pStyle w:val="Heading2"/>
@@ -49465,7 +49465,7 @@
       <w:r>
         <w:t xml:space="preserve"> </w:t>
       </w:r>
-      <w:hyperlink r:id="rId45">
+      <w:hyperlink r:id="rId65">
         <w:r>
           <w:rPr>
             <w:rStyle w:val="Hyperlink"/>
@@ -49490,7 +49490,7 @@
       <w:r>
         <w:t xml:space="preserve"> </w:t>
       </w:r>
-      <w:hyperlink r:id="rId43">
+      <w:hyperlink r:id="rId63">
         <w:r>
           <w:rPr>
             <w:rStyle w:val="Hyperlink"/>
@@ -49515,7 +49515,7 @@
       <w:r>
         <w:t xml:space="preserve"> </w:t>
       </w:r>
-      <w:hyperlink r:id="rId77">
+      <w:hyperlink r:id="rId97">
         <w:r>
           <w:rPr>
             <w:rStyle w:val="Hyperlink"/>
@@ -49540,7 +49540,7 @@
       <w:r>
         <w:t xml:space="preserve"> </w:t>
       </w:r>
-      <w:hyperlink r:id="rId109">
+      <w:hyperlink r:id="rId129">
         <w:r>
           <w:rPr>
             <w:rStyle w:val="Hyperlink"/>
@@ -49565,7 +49565,7 @@
       <w:r>
         <w:t xml:space="preserve"> </w:t>
       </w:r>
-      <w:hyperlink r:id="rId110">
+      <w:hyperlink r:id="rId130">
         <w:r>
           <w:rPr>
             <w:rStyle w:val="Hyperlink"/>
@@ -49602,7 +49602,7 @@
       <w:r>
         <w:t xml:space="preserve"> </w:t>
       </w:r>
-      <w:hyperlink r:id="rId111">
+      <w:hyperlink r:id="rId131">
         <w:r>
           <w:rPr>
             <w:rStyle w:val="Hyperlink"/>
@@ -49619,7 +49619,7 @@
       <w:r>
         <w:t xml:space="preserve"> </w:t>
       </w:r>
-      <w:hyperlink r:id="rId112">
+      <w:hyperlink r:id="rId132">
         <w:r>
           <w:rPr>
             <w:rStyle w:val="Hyperlink"/>
@@ -49636,7 +49636,7 @@
       <w:r>
         <w:t xml:space="preserve"> </w:t>
       </w:r>
-      <w:hyperlink r:id="rId113">
+      <w:hyperlink r:id="rId133">
         <w:r>
           <w:rPr>
             <w:rStyle w:val="Hyperlink"/>
@@ -49653,7 +49653,7 @@
       <w:r>
         <w:t xml:space="preserve"> </w:t>
       </w:r>
-      <w:hyperlink r:id="rId114">
+      <w:hyperlink r:id="rId134">
         <w:r>
           <w:rPr>
             <w:rStyle w:val="Hyperlink"/>
@@ -49670,7 +49670,7 @@
       <w:r>
         <w:t xml:space="preserve"> </w:t>
       </w:r>
-      <w:hyperlink r:id="rId115">
+      <w:hyperlink r:id="rId135">
         <w:r>
           <w:rPr>
             <w:rStyle w:val="Hyperlink"/>
@@ -49687,7 +49687,7 @@
       <w:r>
         <w:t xml:space="preserve"> </w:t>
       </w:r>
-      <w:hyperlink r:id="rId116">
+      <w:hyperlink r:id="rId136">
         <w:r>
           <w:rPr>
             <w:rStyle w:val="Hyperlink"/>
@@ -49745,8 +49745,8 @@
         </w:pict>
       </w:r>
     </w:p>
-    <w:bookmarkEnd w:id="117"/>
-    <w:bookmarkStart w:id="118" w:name="glossary"/>
+    <w:bookmarkEnd w:id="137"/>
+    <w:bookmarkStart w:id="138" w:name="glossary"/>
     <w:p>
       <w:pPr>
         <w:pStyle w:val="Heading2"/>
@@ -50376,8 +50376,8 @@
         </w:pict>
       </w:r>
     </w:p>
-    <w:bookmarkEnd w:id="118"/>
-    <w:bookmarkStart w:id="119" w:name="document-metadata"/>
+    <w:bookmarkEnd w:id="138"/>
+    <w:bookmarkStart w:id="139" w:name="document-metadata"/>
     <w:p>
       <w:pPr>
         <w:pStyle w:val="Heading2"/>
@@ -50622,9 +50622,9 @@
         <w:t xml:space="preserve">This WordPress Operations Runbook is a comprehensive guide for managing WordPress installations in production environments. Regular review and updates are essential. All procedures should be tested in staging before implementation in production.</w:t>
       </w:r>
     </w:p>
-    <w:bookmarkEnd w:id="119"/>
+    <w:bookmarkEnd w:id="139"/>
     <w:sectPr>
-      <w:footerReference r:id="rId9" w:type="default"/>
+      <w:footerReference r:id="rId31" w:type="default"/>
       <w:footnotePr>
         <w:numRestart w:val="eachSect"/>
       </w:footnotePr>

</xml_diff>